<commit_message>
feat(#2_Profile): Add Candidate Profile management (multi-Profile, sections, AI assist, export)
feat(#2_Profile): Add Candidate Profile management (multi-Profile, sections, AI assist, export)
</commit_message>
<xml_diff>
--- a/backend/templates/resume_template.docx
+++ b/backend/templates/resume_template.docx
@@ -49,21 +49,47 @@
             <w:pPr>
               <w:jc w:val="both"/>
             </w:pPr>
+          </w:p>
+        </w:tc>
+        <w:tc>
+          <w:tcPr>
+            <w:tcW w:w="8640" w:type="dxa"/>
+            <w:tcBorders>
+              <w:top w:val="none" w:sz="0" w:space="0" w:color="FFFFFF"/>
+              <w:left w:val="none" w:sz="0" w:space="0" w:color="FFFFFF"/>
+              <w:bottom w:val="none" w:sz="0" w:space="0" w:color="FFFFFF"/>
+              <w:right w:val="none" w:sz="0" w:space="0" w:color="FFFFFF"/>
+            </w:tcBorders>
+            <w:shd w:val="clear" w:color="auto" w:fill="4572B3"/>
+            <w:tcMar>
+              <w:top w:w="150" w:type="dxa"/>
+              <w:left w:w="0" w:type="dxa"/>
+              <w:bottom w:w="150" w:type="dxa"/>
+              <w:right w:w="0" w:type="dxa"/>
+            </w:tcMar>
+            <w:vAlign w:val="center"/>
+          </w:tcPr>
+          <w:p>
+            <w:pPr>
+              <w:spacing w:after="60"/>
+              <w:ind w:left="720"/>
+            </w:pPr>
+            <w:commentRangeStart w:id="0"/>
             <w:r>
               <w:rPr>
                 <w:noProof/>
               </w:rPr>
               <w:drawing>
-                <wp:anchor distT="0" distB="0" distL="114300" distR="114300" simplePos="0" relativeHeight="251658240" behindDoc="0" locked="0" layoutInCell="1" allowOverlap="1" wp14:anchorId="0ABA0F08" wp14:editId="0FEB4579">
+                <wp:anchor distT="0" distB="0" distL="114300" distR="114300" simplePos="0" relativeHeight="251659264" behindDoc="0" locked="0" layoutInCell="1" allowOverlap="1" wp14:anchorId="72C00DB2" wp14:editId="62E548E0">
                   <wp:simplePos x="0" y="0"/>
                   <wp:positionH relativeFrom="column">
-                    <wp:posOffset>-51435</wp:posOffset>
+                    <wp:posOffset>-1370330</wp:posOffset>
                   </wp:positionH>
                   <wp:positionV relativeFrom="paragraph">
-                    <wp:posOffset>-80645</wp:posOffset>
+                    <wp:posOffset>-93980</wp:posOffset>
                   </wp:positionV>
-                  <wp:extent cx="1443990" cy="1303655"/>
-                  <wp:effectExtent l="0" t="0" r="3810" b="4445"/>
+                  <wp:extent cx="1504543" cy="1357200"/>
+                  <wp:effectExtent l="0" t="0" r="0" b="1905"/>
                   <wp:wrapNone/>
                   <wp:docPr id="1" name="Picture 1"/>
                   <wp:cNvGraphicFramePr>
@@ -86,7 +112,7 @@
                               </a:ext>
                             </a:extLst>
                           </a:blip>
-                          <a:srcRect t="2841" b="6876"/>
+                          <a:srcRect t="2841" r="-42" b="6876"/>
                           <a:stretch>
                             <a:fillRect/>
                           </a:stretch>
@@ -94,14 +120,20 @@
                         <pic:spPr bwMode="auto">
                           <a:xfrm>
                             <a:off x="0" y="0"/>
-                            <a:ext cx="1443990" cy="1303655"/>
+                            <a:ext cx="1504543" cy="1357200"/>
                           </a:xfrm>
                           <a:prstGeom prst="rect">
                             <a:avLst/>
                           </a:prstGeom>
+                          <a:noFill/>
                           <a:ln>
                             <a:noFill/>
                           </a:ln>
+                          <a:effectLst>
+                            <a:outerShdw sx="1000" sy="1000" algn="tl" rotWithShape="0">
+                              <a:srgbClr val="333333"/>
+                            </a:outerShdw>
+                          </a:effectLst>
                           <a:extLst>
                             <a:ext uri="{53640926-AAD7-44D8-BBD7-CCE9431645EC}">
                               <a14:shadowObscured xmlns:a14="http://schemas.microsoft.com/office/drawing/2010/main"/>
@@ -120,31 +152,21 @@
                 </wp:anchor>
               </w:drawing>
             </w:r>
-          </w:p>
-        </w:tc>
-        <w:tc>
-          <w:tcPr>
-            <w:tcW w:w="8640" w:type="dxa"/>
-            <w:tcBorders>
-              <w:top w:val="none" w:sz="0" w:space="0" w:color="FFFFFF"/>
-              <w:left w:val="none" w:sz="0" w:space="0" w:color="FFFFFF"/>
-              <w:bottom w:val="none" w:sz="0" w:space="0" w:color="FFFFFF"/>
-              <w:right w:val="none" w:sz="0" w:space="0" w:color="FFFFFF"/>
-            </w:tcBorders>
-            <w:shd w:val="clear" w:color="auto" w:fill="4572B3"/>
-            <w:tcMar>
-              <w:top w:w="150" w:type="dxa"/>
-              <w:left w:w="0" w:type="dxa"/>
-              <w:bottom w:w="0" w:type="dxa"/>
-              <w:right w:w="0" w:type="dxa"/>
-            </w:tcMar>
-            <w:vAlign w:val="center"/>
-          </w:tcPr>
-          <w:p>
-            <w:pPr>
-              <w:spacing w:after="60"/>
-              <w:ind w:left="720"/>
-            </w:pPr>
+            <w:commentRangeEnd w:id="0"/>
+            <w:commentRangeStart w:id="1"/>
+            <w:r>
+              <w:rPr>
+                <w:rStyle w:val="CommentReference"/>
+              </w:rPr>
+              <w:commentReference w:id="0"/>
+            </w:r>
+            <w:commentRangeEnd w:id="1"/>
+            <w:r>
+              <w:rPr>
+                <w:rStyle w:val="CommentReference"/>
+              </w:rPr>
+              <w:commentReference w:id="1"/>
+            </w:r>
             <w:r>
               <w:rPr>
                 <w:rFonts w:ascii="Calibri" w:eastAsia="Calibri" w:hAnsi="Calibri" w:cs="Calibri"/>
@@ -221,16 +243,42 @@
                 <w:bCs/>
               </w:rPr>
             </w:pPr>
-            <w:hyperlink r:id="rId6" w:history="1">
-              <w:r>
-                <w:rPr>
-                  <w:rFonts w:ascii="Calibri" w:hAnsi="Calibri" w:cs="Calibri"/>
-                  <w:color w:val="E8E8E8" w:themeColor="background2"/>
-                  <w:u w:val="single"/>
-                </w:rPr>
-                <w:t>Portfolio / Website</w:t>
-              </w:r>
-            </w:hyperlink>
+            <w:r>
+              <w:fldChar w:fldCharType="begin"/>
+            </w:r>
+            <w:r>
+              <w:instrText>HYPERLINK "https://github.com/yourusername"</w:instrText>
+            </w:r>
+            <w:r>
+              <w:fldChar w:fldCharType="separate"/>
+            </w:r>
+            <w:r>
+              <w:rPr>
+                <w:rFonts w:ascii="Calibri" w:hAnsi="Calibri" w:cs="Calibri"/>
+                <w:color w:val="E8E8E8" w:themeColor="background2"/>
+                <w:u w:val="single"/>
+              </w:rPr>
+              <w:t>P</w:t>
+            </w:r>
+            <w:r>
+              <w:rPr>
+                <w:rFonts w:ascii="Calibri" w:hAnsi="Calibri" w:cs="Calibri"/>
+                <w:color w:val="E8E8E8" w:themeColor="background2"/>
+                <w:u w:val="single"/>
+              </w:rPr>
+              <w:t>o</w:t>
+            </w:r>
+            <w:r>
+              <w:rPr>
+                <w:rFonts w:ascii="Calibri" w:hAnsi="Calibri" w:cs="Calibri"/>
+                <w:color w:val="E8E8E8" w:themeColor="background2"/>
+                <w:u w:val="single"/>
+              </w:rPr>
+              <w:t>rtfolio / Website</w:t>
+            </w:r>
+            <w:r>
+              <w:fldChar w:fldCharType="end"/>
+            </w:r>
             <w:r>
               <w:t xml:space="preserve"> </w:t>
             </w:r>
@@ -241,7 +289,7 @@
               </w:rPr>
               <w:t xml:space="preserve"> | </w:t>
             </w:r>
-            <w:hyperlink r:id="rId7" w:history="1">
+            <w:hyperlink r:id="rId6" w:history="1">
               <w:r>
                 <w:rPr>
                   <w:rFonts w:ascii="Calibri" w:hAnsi="Calibri" w:cs="Calibri"/>
@@ -266,6 +314,7 @@
         <w:jc w:val="both"/>
         <w:divId w:val="506098487"/>
       </w:pPr>
+      <w:commentRangeStart w:id="3"/>
       <w:r>
         <w:rPr>
           <w:rFonts w:ascii="Calibri" w:hAnsi="Calibri" w:cs="Calibri"/>
@@ -277,13 +326,21 @@
         </w:rPr>
         <w:t>Profile &amp; Career</w:t>
       </w:r>
+      <w:commentRangeEnd w:id="3"/>
+      <w:r>
+        <w:rPr>
+          <w:rStyle w:val="CommentReference"/>
+        </w:rPr>
+        <w:commentReference w:id="3"/>
+      </w:r>
     </w:p>
     <w:p>
       <w:pPr>
         <w:spacing w:after="120"/>
         <w:jc w:val="both"/>
-        <w:divId w:val="671416528"/>
-      </w:pPr>
+        <w:divId w:val="1425299644"/>
+      </w:pPr>
+      <w:commentRangeStart w:id="4"/>
       <w:r>
         <w:rPr>
           <w:rFonts w:ascii="Calibri" w:hAnsi="Calibri" w:cs="Calibri"/>
@@ -291,12 +348,19 @@
         </w:rPr>
         <w:t>[2-3 sentence summary: your years of experience, core discipline or specialization, primary tools/methods you work with, and the type of environment where you do your best work.]</w:t>
       </w:r>
+      <w:commentRangeEnd w:id="4"/>
+      <w:r>
+        <w:rPr>
+          <w:rStyle w:val="CommentReference"/>
+        </w:rPr>
+        <w:commentReference w:id="4"/>
+      </w:r>
     </w:p>
     <w:p>
       <w:pPr>
         <w:spacing w:after="120"/>
         <w:jc w:val="both"/>
-        <w:divId w:val="671416528"/>
+        <w:divId w:val="1425299644"/>
       </w:pPr>
       <w:r>
         <w:rPr>
@@ -328,8 +392,9 @@
       <w:pPr>
         <w:spacing w:after="80"/>
         <w:jc w:val="both"/>
-        <w:divId w:val="374163925"/>
-      </w:pPr>
+        <w:divId w:val="1914122178"/>
+      </w:pPr>
+      <w:commentRangeStart w:id="5"/>
       <w:r>
         <w:rPr>
           <w:rFonts w:ascii="Calibri" w:hAnsi="Calibri" w:cs="Calibri"/>
@@ -339,6 +404,13 @@
         </w:rPr>
         <w:t>[Category 1 - e.g. Frontend / Design / Marketing]:</w:t>
       </w:r>
+      <w:commentRangeEnd w:id="5"/>
+      <w:r>
+        <w:rPr>
+          <w:rStyle w:val="CommentReference"/>
+        </w:rPr>
+        <w:commentReference w:id="5"/>
+      </w:r>
       <w:r>
         <w:rPr>
           <w:rFonts w:ascii="Calibri" w:hAnsi="Calibri" w:cs="Calibri"/>
@@ -351,7 +423,7 @@
       <w:pPr>
         <w:spacing w:after="80"/>
         <w:jc w:val="both"/>
-        <w:divId w:val="374163925"/>
+        <w:divId w:val="1914122178"/>
         <w:rPr>
           <w:rFonts w:ascii="Calibri" w:hAnsi="Calibri" w:cs="Calibri"/>
           <w:color w:val="333333"/>
@@ -396,8 +468,9 @@
       <w:pPr>
         <w:spacing w:before="200" w:after="20"/>
         <w:jc w:val="both"/>
-        <w:divId w:val="1070152643"/>
-      </w:pPr>
+        <w:divId w:val="1194228907"/>
+      </w:pPr>
+      <w:commentRangeStart w:id="6"/>
       <w:r>
         <w:rPr>
           <w:rFonts w:ascii="Calibri" w:hAnsi="Calibri" w:cs="Calibri"/>
@@ -409,13 +482,21 @@
         </w:rPr>
         <w:t>[Job Title], [Company Name] [Industry / Brief Descriptor], [Location]</w:t>
       </w:r>
+      <w:commentRangeEnd w:id="6"/>
+      <w:r>
+        <w:rPr>
+          <w:rStyle w:val="CommentReference"/>
+        </w:rPr>
+        <w:commentReference w:id="6"/>
+      </w:r>
     </w:p>
     <w:p>
       <w:pPr>
         <w:spacing w:after="100"/>
         <w:jc w:val="both"/>
-        <w:divId w:val="1070152643"/>
-      </w:pPr>
+        <w:divId w:val="1194228907"/>
+      </w:pPr>
+      <w:commentRangeStart w:id="7"/>
       <w:r>
         <w:rPr>
           <w:rFonts w:ascii="Calibri" w:hAnsi="Calibri" w:cs="Calibri"/>
@@ -427,12 +508,19 @@
         </w:rPr>
         <w:t>[Start Date] — [End Date]</w:t>
       </w:r>
+      <w:commentRangeEnd w:id="7"/>
+      <w:r>
+        <w:rPr>
+          <w:rStyle w:val="CommentReference"/>
+        </w:rPr>
+        <w:commentReference w:id="7"/>
+      </w:r>
     </w:p>
     <w:p>
       <w:pPr>
         <w:spacing w:after="120"/>
         <w:jc w:val="both"/>
-        <w:divId w:val="1070152643"/>
+        <w:divId w:val="1194228907"/>
       </w:pPr>
       <w:r>
         <w:rPr>
@@ -452,14 +540,22 @@
         <w:spacing w:after="70"/>
         <w:ind w:left="260" w:hanging="180"/>
         <w:jc w:val="both"/>
-        <w:divId w:val="1070152643"/>
-      </w:pPr>
+        <w:divId w:val="1194228907"/>
+      </w:pPr>
+      <w:commentRangeStart w:id="8"/>
       <w:r>
         <w:rPr>
           <w:rFonts w:ascii="Calibri" w:hAnsi="Calibri" w:cs="Calibri"/>
           <w:color w:val="333333"/>
         </w:rPr>
         <w:t>[Describe a specific project, feature, or initiative you built or led, including the tools/technologies and your approach.]</w:t>
+      </w:r>
+      <w:commentRangeEnd w:id="8"/>
+      <w:r>
+        <w:rPr>
+          <w:rStyle w:val="CommentReference"/>
+        </w:rPr>
+        <w:commentReference w:id="8"/>
       </w:r>
     </w:p>
     <w:p>
@@ -472,7 +568,7 @@
         <w:spacing w:after="70"/>
         <w:ind w:left="260" w:hanging="180"/>
         <w:jc w:val="both"/>
-        <w:divId w:val="1070152643"/>
+        <w:divId w:val="1194228907"/>
       </w:pPr>
       <w:r>
         <w:rPr>
@@ -492,7 +588,7 @@
         <w:spacing w:after="70"/>
         <w:ind w:left="260" w:hanging="180"/>
         <w:jc w:val="both"/>
-        <w:divId w:val="1070152643"/>
+        <w:divId w:val="1194228907"/>
       </w:pPr>
       <w:r>
         <w:rPr>
@@ -512,7 +608,7 @@
         <w:spacing w:after="70"/>
         <w:ind w:left="260" w:hanging="180"/>
         <w:jc w:val="both"/>
-        <w:divId w:val="1070152643"/>
+        <w:divId w:val="1194228907"/>
       </w:pPr>
       <w:r>
         <w:rPr>
@@ -530,7 +626,7 @@
       <w:pPr>
         <w:spacing w:before="200" w:after="20"/>
         <w:jc w:val="both"/>
-        <w:divId w:val="1070152643"/>
+        <w:divId w:val="1194228907"/>
       </w:pPr>
       <w:r>
         <w:rPr>
@@ -541,36 +637,14 @@
           <w:sz w:val="22"/>
           <w:szCs w:val="22"/>
         </w:rPr>
-        <w:t>[Job Title</w:t>
-      </w:r>
-      <w:r>
-        <w:rPr>
-          <w:rFonts w:ascii="Calibri" w:hAnsi="Calibri" w:cs="Calibri"/>
-          <w:b/>
-          <w:bCs/>
-          <w:color w:val="333333"/>
-          <w:sz w:val="22"/>
-          <w:szCs w:val="22"/>
-        </w:rPr>
-        <w:t xml:space="preserve"> 2 </w:t>
-      </w:r>
-      <w:r>
-        <w:rPr>
-          <w:rFonts w:ascii="Calibri" w:hAnsi="Calibri" w:cs="Calibri"/>
-          <w:b/>
-          <w:bCs/>
-          <w:color w:val="333333"/>
-          <w:sz w:val="22"/>
-          <w:szCs w:val="22"/>
-        </w:rPr>
-        <w:t>], [Company Name] [Industry / Brief Descriptor], [Location]</w:t>
+        <w:t>[Job Title 2 ], [Company Name] [Industry / Brief Descriptor], [Location]</w:t>
       </w:r>
     </w:p>
     <w:p>
       <w:pPr>
         <w:spacing w:after="100"/>
         <w:jc w:val="both"/>
-        <w:divId w:val="1070152643"/>
+        <w:divId w:val="1194228907"/>
       </w:pPr>
       <w:r>
         <w:rPr>
@@ -588,7 +662,7 @@
       <w:pPr>
         <w:spacing w:after="120"/>
         <w:jc w:val="both"/>
-        <w:divId w:val="1070152643"/>
+        <w:divId w:val="1194228907"/>
       </w:pPr>
       <w:r>
         <w:rPr>
@@ -608,7 +682,7 @@
         <w:spacing w:after="70"/>
         <w:ind w:left="260" w:hanging="180"/>
         <w:jc w:val="both"/>
-        <w:divId w:val="1070152643"/>
+        <w:divId w:val="1194228907"/>
       </w:pPr>
       <w:r>
         <w:rPr>
@@ -628,7 +702,7 @@
         <w:spacing w:after="70"/>
         <w:ind w:left="260" w:hanging="180"/>
         <w:jc w:val="both"/>
-        <w:divId w:val="1070152643"/>
+        <w:divId w:val="1194228907"/>
       </w:pPr>
       <w:r>
         <w:rPr>
@@ -648,7 +722,7 @@
         <w:spacing w:after="70"/>
         <w:ind w:left="260" w:hanging="180"/>
         <w:jc w:val="both"/>
-        <w:divId w:val="1070152643"/>
+        <w:divId w:val="1194228907"/>
       </w:pPr>
       <w:r>
         <w:rPr>
@@ -668,7 +742,7 @@
         <w:spacing w:after="70"/>
         <w:ind w:left="260" w:hanging="180"/>
         <w:jc w:val="both"/>
-        <w:divId w:val="1070152643"/>
+        <w:divId w:val="1194228907"/>
       </w:pPr>
       <w:r>
         <w:rPr>
@@ -686,7 +760,7 @@
       <w:pPr>
         <w:spacing w:before="200" w:after="20"/>
         <w:jc w:val="both"/>
-        <w:divId w:val="233440060"/>
+        <w:divId w:val="1194228907"/>
       </w:pPr>
       <w:r>
         <w:rPr>
@@ -710,7 +784,7 @@
         <w:spacing w:after="70"/>
         <w:ind w:left="260" w:hanging="180"/>
         <w:jc w:val="both"/>
-        <w:divId w:val="233440060"/>
+        <w:divId w:val="1194228907"/>
       </w:pPr>
       <w:r>
         <w:rPr>
@@ -730,7 +804,7 @@
         <w:spacing w:after="70"/>
         <w:ind w:left="260" w:hanging="180"/>
         <w:jc w:val="both"/>
-        <w:divId w:val="233440060"/>
+        <w:divId w:val="1194228907"/>
       </w:pPr>
       <w:r>
         <w:rPr>
@@ -766,7 +840,7 @@
       <w:pPr>
         <w:spacing w:before="200" w:after="20"/>
         <w:jc w:val="both"/>
-        <w:divId w:val="133833668"/>
+        <w:divId w:val="888614704"/>
       </w:pPr>
       <w:r>
         <w:rPr>
@@ -784,7 +858,7 @@
       <w:pPr>
         <w:spacing w:after="100"/>
         <w:jc w:val="both"/>
-        <w:divId w:val="133833668"/>
+        <w:divId w:val="888614704"/>
       </w:pPr>
       <w:r>
         <w:rPr>
@@ -820,7 +894,6 @@
       <w:pPr>
         <w:spacing w:after="100"/>
         <w:jc w:val="both"/>
-        <w:divId w:val="233206951"/>
       </w:pPr>
       <w:r>
         <w:rPr>
@@ -835,6 +908,206 @@
         <w:jc w:val="both"/>
       </w:pPr>
     </w:p>
+    <w:p>
+      <w:r>
+        <w:br w:type="page"/>
+      </w:r>
+    </w:p>
+    <w:p>
+      <w:r>
+        <w:rPr>
+          <w:b/>
+        </w:rPr>
+        <w:t>ALTERNATE HEADER (no photo) — see comment</w:t>
+      </w:r>
+    </w:p>
+    <w:tbl>
+      <w:tblPr>
+        <w:tblW w:w="10845" w:type="dxa"/>
+        <w:tblBorders>
+          <w:top w:val="single" w:sz="4" w:space="0" w:color="auto"/>
+          <w:left w:val="single" w:sz="4" w:space="0" w:color="auto"/>
+          <w:bottom w:val="single" w:sz="4" w:space="0" w:color="auto"/>
+          <w:right w:val="single" w:sz="4" w:space="0" w:color="auto"/>
+          <w:insideH w:val="single" w:sz="4" w:space="0" w:color="auto"/>
+          <w:insideV w:val="single" w:sz="4" w:space="0" w:color="auto"/>
+        </w:tblBorders>
+        <w:tblCellMar>
+          <w:left w:w="0" w:type="dxa"/>
+          <w:right w:w="10" w:type="dxa"/>
+        </w:tblCellMar>
+        <w:tblLook w:val="04A0" w:firstRow="1" w:lastRow="0" w:firstColumn="1" w:lastColumn="0" w:noHBand="0" w:noVBand="1"/>
+      </w:tblPr>
+      <w:tblGrid>
+        <w:gridCol w:w="10845"/>
+      </w:tblGrid>
+      <w:tr>
+        <w:trPr>
+          <w:trHeight w:val="1925"/>
+        </w:trPr>
+        <w:tc>
+          <w:tcPr>
+            <w:tcW w:w="10845" w:type="dxa"/>
+            <w:tcBorders>
+              <w:top w:val="none" w:sz="0" w:space="0" w:color="FFFFFF"/>
+              <w:left w:val="none" w:sz="0" w:space="0" w:color="FFFFFF"/>
+              <w:bottom w:val="none" w:sz="0" w:space="0" w:color="FFFFFF"/>
+              <w:right w:val="none" w:sz="0" w:space="0" w:color="FFFFFF"/>
+            </w:tcBorders>
+            <w:shd w:val="clear" w:color="auto" w:fill="4572B3"/>
+            <w:tcMar>
+              <w:top w:w="150" w:type="dxa"/>
+              <w:left w:w="227" w:type="dxa"/>
+              <w:bottom w:w="150" w:type="dxa"/>
+              <w:right w:w="0" w:type="dxa"/>
+            </w:tcMar>
+            <w:vAlign w:val="center"/>
+          </w:tcPr>
+          <w:p>
+            <w:pPr>
+              <w:spacing w:after="60"/>
+            </w:pPr>
+            <w:commentRangeStart w:id="2"/>
+            <w:r>
+              <w:rPr>
+                <w:rFonts w:ascii="Calibri" w:eastAsia="Calibri" w:hAnsi="Calibri" w:cs="Calibri"/>
+                <w:b/>
+                <w:bCs/>
+                <w:color w:val="FFFFFF"/>
+                <w:sz w:val="40"/>
+                <w:szCs w:val="40"/>
+              </w:rPr>
+              <w:t>Renan Fayad</w:t>
+            </w:r>
+            <w:commentRangeEnd w:id="2"/>
+            <w:r>
+              <w:rPr>
+                <w:rStyle w:val="CommentReference"/>
+              </w:rPr>
+              <w:commentReference w:id="2"/>
+            </w:r>
+          </w:p>
+          <w:p>
+            <w:pPr>
+              <w:spacing w:after="120"/>
+              <w:rPr>
+                <w:sz w:val="24"/>
+                <w:szCs w:val="24"/>
+              </w:rPr>
+            </w:pPr>
+            <w:r>
+              <w:rPr>
+                <w:rFonts w:ascii="Calibri" w:eastAsia="Calibri" w:hAnsi="Calibri" w:cs="Calibri"/>
+                <w:color w:val="FFFFFF"/>
+                <w:sz w:val="24"/>
+                <w:szCs w:val="24"/>
+              </w:rPr>
+              <w:t>[Career Title] | [Key Skill, Key Skill, Key Skill, Key Skill]</w:t>
+            </w:r>
+          </w:p>
+          <w:p>
+            <w:pPr>
+              <w:spacing w:line="276" w:lineRule="auto"/>
+              <w:rPr>
+                <w:rFonts w:ascii="Calibri" w:hAnsi="Calibri" w:cs="Calibri"/>
+                <w:color w:val="E8E8E8" w:themeColor="background2"/>
+              </w:rPr>
+            </w:pPr>
+            <w:r>
+              <w:rPr>
+                <w:rFonts w:ascii="Calibri" w:hAnsi="Calibri" w:cs="Calibri"/>
+                <w:color w:val="E8E8E8" w:themeColor="background2"/>
+              </w:rPr>
+              <w:t>email@example.com | +1 (000) 000-0000</w:t>
+            </w:r>
+            <w:r>
+              <w:rPr>
+                <w:color w:val="E8E8E8" w:themeColor="background2"/>
+              </w:rPr>
+              <w:t xml:space="preserve">         </w:t>
+            </w:r>
+            <w:r>
+              <w:rPr>
+                <w:color w:val="E8E8E8" w:themeColor="background2"/>
+              </w:rPr>
+              <w:br/>
+            </w:r>
+            <w:r>
+              <w:rPr>
+                <w:rFonts w:ascii="Calibri" w:hAnsi="Calibri" w:cs="Calibri"/>
+                <w:color w:val="E8E8E8" w:themeColor="background2"/>
+              </w:rPr>
+              <w:t>Country, City</w:t>
+            </w:r>
+          </w:p>
+          <w:p>
+            <w:pPr>
+              <w:spacing w:line="276" w:lineRule="auto"/>
+              <w:rPr>
+                <w:b/>
+                <w:bCs/>
+              </w:rPr>
+            </w:pPr>
+            <w:r>
+              <w:fldChar w:fldCharType="begin"/>
+            </w:r>
+            <w:r>
+              <w:instrText>HYPERLINK "https://github.com/yourusername"</w:instrText>
+            </w:r>
+            <w:r>
+              <w:fldChar w:fldCharType="separate"/>
+            </w:r>
+            <w:r>
+              <w:rPr>
+                <w:rFonts w:ascii="Calibri" w:hAnsi="Calibri" w:cs="Calibri"/>
+                <w:color w:val="E8E8E8" w:themeColor="background2"/>
+                <w:u w:val="single"/>
+              </w:rPr>
+              <w:t>P</w:t>
+            </w:r>
+            <w:r>
+              <w:rPr>
+                <w:rFonts w:ascii="Calibri" w:hAnsi="Calibri" w:cs="Calibri"/>
+                <w:color w:val="E8E8E8" w:themeColor="background2"/>
+                <w:u w:val="single"/>
+              </w:rPr>
+              <w:t>o</w:t>
+            </w:r>
+            <w:r>
+              <w:rPr>
+                <w:rFonts w:ascii="Calibri" w:hAnsi="Calibri" w:cs="Calibri"/>
+                <w:color w:val="E8E8E8" w:themeColor="background2"/>
+                <w:u w:val="single"/>
+              </w:rPr>
+              <w:t>rtfolio / Website</w:t>
+            </w:r>
+            <w:r>
+              <w:fldChar w:fldCharType="end"/>
+            </w:r>
+            <w:r>
+              <w:t xml:space="preserve"> </w:t>
+            </w:r>
+            <w:r>
+              <w:rPr>
+                <w:rFonts w:ascii="Calibri" w:hAnsi="Calibri" w:cs="Calibri"/>
+                <w:color w:val="E8E8E8" w:themeColor="background2"/>
+              </w:rPr>
+              <w:t xml:space="preserve"> | </w:t>
+            </w:r>
+            <w:hyperlink r:id="rId5" w:history="1">
+              <w:r>
+                <w:rPr>
+                  <w:rFonts w:ascii="Calibri" w:hAnsi="Calibri" w:cs="Calibri"/>
+                  <w:color w:val="E8E8E8" w:themeColor="background2"/>
+                  <w:u w:val="single"/>
+                </w:rPr>
+                <w:t>LinkedIn</w:t>
+              </w:r>
+            </w:hyperlink>
+          </w:p>
+        </w:tc>
+      </w:tr>
+    </w:tbl>
     <w:sectPr>
       <w:pgSz w:w="12240" w:h="15840"/>
       <w:pgMar w:top="720" w:right="720" w:bottom="720" w:left="720" w:header="708" w:footer="708" w:gutter="0"/>
@@ -843,6 +1116,155 @@
     </w:sectPr>
   </w:body>
 </w:document>
+</file>
+
+<file path=word/comments.xml><?xml version="1.0" encoding="utf-8"?>
+<w:comments xmlns:a="http://schemas.openxmlformats.org/drawingml/2006/main" xmlns:pic="http://schemas.openxmlformats.org/drawingml/2006/picture" xmlns:r="http://schemas.openxmlformats.org/officeDocument/2006/relationships" xmlns:w="http://schemas.openxmlformats.org/wordprocessingml/2006/main" xmlns:wp="http://schemas.openxmlformats.org/drawingml/2006/wordprocessingDrawing" xmlns:mc="http://schemas.openxmlformats.org/markup-compatibility/2006" xmlns:a14="http://schemas.microsoft.com/office/drawing/2010/main" xmlns:w14="http://schemas.microsoft.com/office/word/2010/wordml" xmlns:wpc="http://schemas.microsoft.com/office/word/2010/wordprocessingCanvas">
+  <w:comment w:id="0" w:author="Job Assistant" w:initials="JA" w:date="2026-09-23T20:35:20Z">
+    <w:p>
+      <w:pPr>
+        <w:pStyle w:val="CommentText"/>
+      </w:pPr>
+      <w:r>
+        <w:rPr>
+          <w:rStyle w:val="CommentReference"/>
+        </w:rPr>
+        <w:annotationRef/>
+      </w:r>
+      <w:r>
+        <w:t>Photo placeholder. Its FRAME SIZE (not this image) is what matters — every export keeps this exact width/height and center-crops the Profile's own uploaded photo to match it. Resize this frame and the export follows; the placeholder image itself is never used.</w:t>
+      </w:r>
+    </w:p>
+  </w:comment>
+  <w:comment w:id="1" w:author="Job Assistant" w:initials="JA" w:date="2026-09-23T20:35:20Z">
+    <w:p>
+      <w:pPr>
+        <w:pStyle w:val="CommentText"/>
+      </w:pPr>
+      <w:r>
+        <w:rPr>
+          <w:rStyle w:val="CommentReference"/>
+        </w:rPr>
+        <w:annotationRef/>
+      </w:r>
+      <w:r>
+        <w:t>This whole banner (fonts, sizes, colors, the photo frame) is cloned for every Profile that HAS a photo, recolored to that Profile's own primary color. See the alternate no-photo banner on the last page for when a Profile has none.</w:t>
+      </w:r>
+    </w:p>
+  </w:comment>
+  <w:comment w:id="2" w:author="Job Assistant" w:initials="JA" w:date="2026-09-23T20:35:20Z">
+    <w:p>
+      <w:pPr>
+        <w:pStyle w:val="CommentText"/>
+      </w:pPr>
+      <w:r>
+        <w:rPr>
+          <w:rStyle w:val="CommentReference"/>
+        </w:rPr>
+        <w:annotationRef/>
+      </w:r>
+      <w:r>
+        <w:t>Used instead of the banner on page 1 whenever a Profile has no photo — same fonts/sizes/colors, just one full-width cell instead of a photo column. Keep this in sync with page 1's banner by hand if you change one.</w:t>
+      </w:r>
+    </w:p>
+  </w:comment>
+  <w:comment w:id="3" w:author="Job Assistant" w:initials="JA" w:date="2026-09-23T20:35:20Z">
+    <w:p>
+      <w:pPr>
+        <w:pStyle w:val="CommentText"/>
+      </w:pPr>
+      <w:r>
+        <w:rPr>
+          <w:rStyle w:val="CommentReference"/>
+        </w:rPr>
+        <w:annotationRef/>
+      </w:r>
+      <w:r>
+        <w:t>This paragraph's formatting (font, size, color, spacing, and the colored rule under it) is cloned for every section title in the export, recolored to the Profile's secondary color.</w:t>
+      </w:r>
+    </w:p>
+  </w:comment>
+  <w:comment w:id="4" w:author="Job Assistant" w:initials="JA" w:date="2026-09-23T20:35:20Z">
+    <w:p>
+      <w:pPr>
+        <w:pStyle w:val="CommentText"/>
+      </w:pPr>
+      <w:r>
+        <w:rPr>
+          <w:rStyle w:val="CommentReference"/>
+        </w:rPr>
+        <w:annotationRef/>
+      </w:r>
+      <w:r>
+        <w:t>Base formatting for plain body text throughout the export: Text-section bodies, Pairs-section rows, and any non-bulleted line.</w:t>
+      </w:r>
+    </w:p>
+  </w:comment>
+  <w:comment w:id="5" w:author="Job Assistant" w:initials="JA" w:date="2026-09-23T20:35:20Z">
+    <w:p>
+      <w:pPr>
+        <w:pStyle w:val="CommentText"/>
+      </w:pPr>
+      <w:r>
+        <w:rPr>
+          <w:rStyle w:val="CommentReference"/>
+        </w:rPr>
+        <w:annotationRef/>
+      </w:r>
+      <w:r>
+        <w:t>This paragraph's two-run shape (bold label, then a plain value) is cloned for each category in a Tags section.</w:t>
+      </w:r>
+    </w:p>
+  </w:comment>
+  <w:comment w:id="6" w:author="Job Assistant" w:initials="JA" w:date="2026-09-23T20:35:20Z">
+    <w:p>
+      <w:pPr>
+        <w:pStyle w:val="CommentText"/>
+      </w:pPr>
+      <w:r>
+        <w:rPr>
+          <w:rStyle w:val="CommentReference"/>
+        </w:rPr>
+        <w:annotationRef/>
+      </w:r>
+      <w:r>
+        <w:t>This paragraph's formatting (bold) is cloned for every Experience/Education entry's heading line. Left out entirely for an entry with no heading (e.g. a summarized, undetailed role).</w:t>
+      </w:r>
+    </w:p>
+  </w:comment>
+  <w:comment w:id="7" w:author="Job Assistant" w:initials="JA" w:date="2026-09-23T20:35:20Z">
+    <w:p>
+      <w:pPr>
+        <w:pStyle w:val="CommentText"/>
+      </w:pPr>
+      <w:r>
+        <w:rPr>
+          <w:rStyle w:val="CommentReference"/>
+        </w:rPr>
+        <w:annotationRef/>
+      </w:r>
+      <w:r>
+        <w:t>This paragraph's formatting (smaller, gray, its own line) is cloned for every entry's dates line. Left out entirely when an entry has no dates.</w:t>
+      </w:r>
+    </w:p>
+  </w:comment>
+  <w:comment w:id="8" w:author="Job Assistant" w:initials="JA" w:date="2026-09-23T20:35:20Z">
+    <w:p>
+      <w:pPr>
+        <w:pStyle w:val="CommentText"/>
+      </w:pPr>
+      <w:r>
+        <w:rPr>
+          <w:rStyle w:val="CommentReference"/>
+        </w:rPr>
+        <w:annotationRef/>
+      </w:r>
+      <w:r>
+        <w:t>This paragraph's formatting (hanging indent, bullet) is cloned for every bulleted line in the export — entry descriptions, Markdown-lite "- " lines, and every item in a List section.</w:t>
+      </w:r>
+    </w:p>
+  </w:comment>
+</w:comments>
 </file>
 
 <file path=word/numbering.xml><?xml version="1.0" encoding="utf-8"?>

</xml_diff>